<commit_message>
Ajout documentation architecture décisionnelle et schémas drawDB
</commit_message>
<xml_diff>
--- a/rapport_analyse/document_synthese_architecture_immo_GAUDIN_MAURIN.docx
+++ b/rapport_analyse/document_synthese_architecture_immo_GAUDIN_MAURIN.docx
@@ -3729,38 +3729,30 @@
       </w:pPr>
       <w:r>
         <w:rPr>
-          <w:rFonts w:ascii="Arial" w:hAnsi="Arial" w:cs="Arial"/>
           <w:noProof/>
-          <w:sz w:val="22"/>
         </w:rPr>
         <w:lastRenderedPageBreak/>
         <w:drawing>
-          <wp:anchor distT="0" distB="0" distL="114300" distR="114300" simplePos="0" relativeHeight="251637760" behindDoc="1" locked="0" layoutInCell="1" allowOverlap="1" wp14:anchorId="121D7B18" wp14:editId="7F1FF168">
+          <wp:anchor distT="0" distB="0" distL="114300" distR="114300" simplePos="0" relativeHeight="251682816" behindDoc="1" locked="0" layoutInCell="1" allowOverlap="1" wp14:anchorId="02C09386" wp14:editId="22DA5BA9">
             <wp:simplePos x="0" y="0"/>
             <wp:positionH relativeFrom="column">
-              <wp:posOffset>20320</wp:posOffset>
+              <wp:posOffset>-37465</wp:posOffset>
             </wp:positionH>
             <wp:positionV relativeFrom="paragraph">
-              <wp:posOffset>20320</wp:posOffset>
+              <wp:posOffset>99695</wp:posOffset>
             </wp:positionV>
-            <wp:extent cx="4535170" cy="3844290"/>
-            <wp:effectExtent l="19050" t="19050" r="17780" b="22860"/>
+            <wp:extent cx="4572000" cy="3733800"/>
+            <wp:effectExtent l="19050" t="19050" r="19050" b="19050"/>
             <wp:wrapTight wrapText="bothSides">
               <wp:wrapPolygon edited="0">
-                <wp:start x="-91" y="-107"/>
-                <wp:lineTo x="-91" y="21621"/>
-                <wp:lineTo x="21594" y="21621"/>
-                <wp:lineTo x="21594" y="-107"/>
-                <wp:lineTo x="-91" y="-107"/>
+                <wp:start x="-90" y="-110"/>
+                <wp:lineTo x="-90" y="21600"/>
+                <wp:lineTo x="21600" y="21600"/>
+                <wp:lineTo x="21600" y="-110"/>
+                <wp:lineTo x="-90" y="-110"/>
               </wp:wrapPolygon>
             </wp:wrapTight>
-            <wp:docPr id="3" name="Image 2">
-              <a:extLst xmlns:a="http://schemas.openxmlformats.org/drawingml/2006/main">
-                <a:ext uri="{FF2B5EF4-FFF2-40B4-BE49-F238E27FC236}">
-                  <a16:creationId xmlns:a16="http://schemas.microsoft.com/office/drawing/2014/main" id="{B57BE6FD-469E-9A29-416D-0AAD135666CD}"/>
-                </a:ext>
-              </a:extLst>
-            </wp:docPr>
+            <wp:docPr id="519327432" name="Image 3"/>
             <wp:cNvGraphicFramePr>
               <a:graphicFrameLocks xmlns:a="http://schemas.openxmlformats.org/drawingml/2006/main" noChangeAspect="1"/>
             </wp:cNvGraphicFramePr>
@@ -3768,36 +3760,43 @@
               <a:graphicData uri="http://schemas.openxmlformats.org/drawingml/2006/picture">
                 <pic:pic xmlns:pic="http://schemas.openxmlformats.org/drawingml/2006/picture">
                   <pic:nvPicPr>
-                    <pic:cNvPr id="3" name="Image 2">
+                    <pic:cNvPr id="0" name="Picture 1"/>
+                    <pic:cNvPicPr>
+                      <a:picLocks noChangeAspect="1" noChangeArrowheads="1"/>
+                    </pic:cNvPicPr>
+                  </pic:nvPicPr>
+                  <pic:blipFill rotWithShape="1">
+                    <a:blip r:embed="rId9">
                       <a:extLst>
-                        <a:ext uri="{FF2B5EF4-FFF2-40B4-BE49-F238E27FC236}">
-                          <a16:creationId xmlns:a16="http://schemas.microsoft.com/office/drawing/2014/main" id="{B57BE6FD-469E-9A29-416D-0AAD135666CD}"/>
+                        <a:ext uri="{28A0092B-C50C-407E-A947-70E740481C1C}">
+                          <a14:useLocalDpi xmlns:a14="http://schemas.microsoft.com/office/drawing/2010/main" val="0"/>
                         </a:ext>
                       </a:extLst>
-                    </pic:cNvPr>
-                    <pic:cNvPicPr>
-                      <a:picLocks noChangeAspect="1"/>
-                    </pic:cNvPicPr>
-                  </pic:nvPicPr>
-                  <pic:blipFill>
-                    <a:blip r:embed="rId9"/>
+                    </a:blip>
+                    <a:srcRect l="8742" r="5315"/>
                     <a:stretch>
                       <a:fillRect/>
                     </a:stretch>
                   </pic:blipFill>
-                  <pic:spPr>
+                  <pic:spPr bwMode="auto">
                     <a:xfrm>
                       <a:off x="0" y="0"/>
-                      <a:ext cx="4535170" cy="3844290"/>
+                      <a:ext cx="4572000" cy="3733800"/>
                     </a:xfrm>
                     <a:prstGeom prst="rect">
                       <a:avLst/>
                     </a:prstGeom>
+                    <a:noFill/>
                     <a:ln>
                       <a:solidFill>
                         <a:schemeClr val="tx1"/>
                       </a:solidFill>
                     </a:ln>
+                    <a:extLst>
+                      <a:ext uri="{53640926-AAD7-44D8-BBD7-CCE9431645EC}">
+                        <a14:shadowObscured xmlns:a14="http://schemas.microsoft.com/office/drawing/2010/main"/>
+                      </a:ext>
+                    </a:extLst>
                   </pic:spPr>
                 </pic:pic>
               </a:graphicData>
@@ -3818,7 +3817,7 @@
         <mc:AlternateContent>
           <mc:Choice Requires="wps">
             <w:drawing>
-              <wp:anchor distT="0" distB="0" distL="114300" distR="114300" simplePos="0" relativeHeight="251644928" behindDoc="1" locked="0" layoutInCell="1" allowOverlap="1" wp14:anchorId="340836A0" wp14:editId="7BAE7686">
+              <wp:anchor distT="0" distB="0" distL="114300" distR="114300" simplePos="0" relativeHeight="251644928" behindDoc="1" locked="0" layoutInCell="1" allowOverlap="1" wp14:anchorId="340836A0" wp14:editId="133D6DCA">
                 <wp:simplePos x="0" y="0"/>
                 <wp:positionH relativeFrom="column">
                   <wp:posOffset>4625340</wp:posOffset>
@@ -20474,6 +20473,7 @@
   <w:style w:type="character" w:default="1" w:styleId="Policepardfaut">
     <w:name w:val="Default Paragraph Font"/>
     <w:uiPriority w:val="1"/>
+    <w:semiHidden/>
     <w:unhideWhenUsed/>
   </w:style>
   <w:style w:type="table" w:default="1" w:styleId="TableauNormal">

</xml_diff>